<commit_message>
sigo cambiando estilos y texto
</commit_message>
<xml_diff>
--- a/la historia del proyecto.docx
+++ b/la historia del proyecto.docx
@@ -253,6 +253,40 @@
           <w:rFonts w:ascii="Courier New" w:hAnsi="Courier New" w:cs="Courier New"/>
         </w:rPr>
       </w:pPr>
+      <w:r>
+        <w:rPr>
+          <w:rFonts w:ascii="Courier New" w:hAnsi="Courier New" w:cs="Courier New"/>
+        </w:rPr>
+        <w:t xml:space="preserve">Bueno, estoy luchando con los colores, que todo sea coherente y además que al cambiar de pantalla se siga leyendo, medio </w:t>
+      </w:r>
+      <w:proofErr w:type="spellStart"/>
+      <w:r>
+        <w:rPr>
+          <w:rFonts w:ascii="Courier New" w:hAnsi="Courier New" w:cs="Courier New"/>
+        </w:rPr>
+        <w:t>compliqueti</w:t>
+      </w:r>
+      <w:proofErr w:type="spellEnd"/>
+      <w:r>
+        <w:rPr>
+          <w:rFonts w:ascii="Courier New" w:hAnsi="Courier New" w:cs="Courier New"/>
+        </w:rPr>
+        <w:t xml:space="preserve">. Cambié la ubicación del texto en la portada por arriba a la derecha y le </w:t>
+      </w:r>
+      <w:proofErr w:type="spellStart"/>
+      <w:r>
+        <w:rPr>
+          <w:rFonts w:ascii="Courier New" w:hAnsi="Courier New" w:cs="Courier New"/>
+        </w:rPr>
+        <w:t>dí</w:t>
+      </w:r>
+      <w:proofErr w:type="spellEnd"/>
+      <w:r>
+        <w:rPr>
+          <w:rFonts w:ascii="Courier New" w:hAnsi="Courier New" w:cs="Courier New"/>
+        </w:rPr>
+        <w:t xml:space="preserve"> más espacio</w:t>
+      </w:r>
     </w:p>
     <w:sectPr>
       <w:pgSz w:w="11906" w:h="16838"/>

</xml_diff>

<commit_message>
agregando las fotos y los precios de las flores, más cambios de estilo en el CSS
</commit_message>
<xml_diff>
--- a/la historia del proyecto.docx
+++ b/la historia del proyecto.docx
@@ -53,21 +53,7 @@
         <w:rPr>
           <w:rFonts w:ascii="Courier New" w:hAnsi="Courier New" w:cs="Courier New"/>
         </w:rPr>
-        <w:t>Armé un .</w:t>
-      </w:r>
-      <w:proofErr w:type="spellStart"/>
-      <w:r>
-        <w:rPr>
-          <w:rFonts w:ascii="Courier New" w:hAnsi="Courier New" w:cs="Courier New"/>
-        </w:rPr>
-        <w:t>txt</w:t>
-      </w:r>
-      <w:proofErr w:type="spellEnd"/>
-      <w:r>
-        <w:rPr>
-          <w:rFonts w:ascii="Courier New" w:hAnsi="Courier New" w:cs="Courier New"/>
-        </w:rPr>
-        <w:t xml:space="preserve"> donde colocaré los enlaces que usé para mi proyecto.</w:t>
+        <w:t>Armé un .txt donde colocaré los enlaces que usé para mi proyecto.</w:t>
       </w:r>
     </w:p>
     <w:p>
@@ -85,21 +71,7 @@
         <w:rPr>
           <w:rFonts w:ascii="Courier New" w:hAnsi="Courier New" w:cs="Courier New"/>
         </w:rPr>
-        <w:t xml:space="preserve">Agregué un </w:t>
-      </w:r>
-      <w:proofErr w:type="spellStart"/>
-      <w:r>
-        <w:rPr>
-          <w:rFonts w:ascii="Courier New" w:hAnsi="Courier New" w:cs="Courier New"/>
-        </w:rPr>
-        <w:t>favicon</w:t>
-      </w:r>
-      <w:proofErr w:type="spellEnd"/>
-      <w:r>
-        <w:rPr>
-          <w:rFonts w:ascii="Courier New" w:hAnsi="Courier New" w:cs="Courier New"/>
-        </w:rPr>
-        <w:t xml:space="preserve"> de florcitas</w:t>
+        <w:t>Agregué un favicon de florcitas</w:t>
       </w:r>
     </w:p>
     <w:p>
@@ -129,49 +101,7 @@
         <w:rPr>
           <w:rFonts w:ascii="Courier New" w:hAnsi="Courier New" w:cs="Courier New"/>
         </w:rPr>
-        <w:t xml:space="preserve">o en el </w:t>
-      </w:r>
-      <w:proofErr w:type="spellStart"/>
-      <w:r>
-        <w:rPr>
-          <w:rFonts w:ascii="Courier New" w:hAnsi="Courier New" w:cs="Courier New"/>
-        </w:rPr>
-        <w:t>html</w:t>
-      </w:r>
-      <w:proofErr w:type="spellEnd"/>
-      <w:r>
-        <w:rPr>
-          <w:rFonts w:ascii="Courier New" w:hAnsi="Courier New" w:cs="Courier New"/>
-        </w:rPr>
-        <w:t xml:space="preserve"> como en el </w:t>
-      </w:r>
-      <w:proofErr w:type="spellStart"/>
-      <w:r>
-        <w:rPr>
-          <w:rFonts w:ascii="Courier New" w:hAnsi="Courier New" w:cs="Courier New"/>
-        </w:rPr>
-        <w:t>css</w:t>
-      </w:r>
-      <w:proofErr w:type="spellEnd"/>
-      <w:r>
-        <w:rPr>
-          <w:rFonts w:ascii="Courier New" w:hAnsi="Courier New" w:cs="Courier New"/>
-        </w:rPr>
-        <w:t xml:space="preserve">, elegí un campo floral (imagen gratuita de </w:t>
-      </w:r>
-      <w:proofErr w:type="spellStart"/>
-      <w:r>
-        <w:rPr>
-          <w:rFonts w:ascii="Courier New" w:hAnsi="Courier New" w:cs="Courier New"/>
-        </w:rPr>
-        <w:t>pixabay</w:t>
-      </w:r>
-      <w:proofErr w:type="spellEnd"/>
-      <w:r>
-        <w:rPr>
-          <w:rFonts w:ascii="Courier New" w:hAnsi="Courier New" w:cs="Courier New"/>
-        </w:rPr>
-        <w:t>) como foto principal</w:t>
+        <w:t>o en el html como en el css, elegí un campo floral (imagen gratuita de pixabay) como foto principal</w:t>
       </w:r>
     </w:p>
     <w:p>
@@ -201,21 +131,7 @@
         <w:rPr>
           <w:rFonts w:ascii="Courier New" w:hAnsi="Courier New" w:cs="Courier New"/>
         </w:rPr>
-        <w:t xml:space="preserve"> en </w:t>
-      </w:r>
-      <w:proofErr w:type="spellStart"/>
-      <w:r>
-        <w:rPr>
-          <w:rFonts w:ascii="Courier New" w:hAnsi="Courier New" w:cs="Courier New"/>
-        </w:rPr>
-        <w:t>canvas</w:t>
-      </w:r>
-      <w:proofErr w:type="spellEnd"/>
-      <w:r>
-        <w:rPr>
-          <w:rFonts w:ascii="Courier New" w:hAnsi="Courier New" w:cs="Courier New"/>
-        </w:rPr>
-        <w:t xml:space="preserve"> (me cansé de buscar imágenes gratuitas)</w:t>
+        <w:t xml:space="preserve"> en canvas (me cansé de buscar imágenes gratuitas)</w:t>
       </w:r>
       <w:r>
         <w:rPr>
@@ -257,35 +173,31 @@
         <w:rPr>
           <w:rFonts w:ascii="Courier New" w:hAnsi="Courier New" w:cs="Courier New"/>
         </w:rPr>
-        <w:t xml:space="preserve">Bueno, estoy luchando con los colores, que todo sea coherente y además que al cambiar de pantalla se siga leyendo, medio </w:t>
-      </w:r>
-      <w:proofErr w:type="spellStart"/>
-      <w:r>
-        <w:rPr>
-          <w:rFonts w:ascii="Courier New" w:hAnsi="Courier New" w:cs="Courier New"/>
-        </w:rPr>
-        <w:t>compliqueti</w:t>
-      </w:r>
-      <w:proofErr w:type="spellEnd"/>
-      <w:r>
-        <w:rPr>
-          <w:rFonts w:ascii="Courier New" w:hAnsi="Courier New" w:cs="Courier New"/>
-        </w:rPr>
-        <w:t xml:space="preserve">. Cambié la ubicación del texto en la portada por arriba a la derecha y le </w:t>
-      </w:r>
-      <w:proofErr w:type="spellStart"/>
-      <w:r>
-        <w:rPr>
-          <w:rFonts w:ascii="Courier New" w:hAnsi="Courier New" w:cs="Courier New"/>
-        </w:rPr>
-        <w:t>dí</w:t>
-      </w:r>
-      <w:proofErr w:type="spellEnd"/>
-      <w:r>
-        <w:rPr>
-          <w:rFonts w:ascii="Courier New" w:hAnsi="Courier New" w:cs="Courier New"/>
-        </w:rPr>
-        <w:t xml:space="preserve"> más espacio</w:t>
+        <w:t>Bueno, estoy luchando con los colores, que todo sea coherente y además que al cambiar de pantalla se siga leyendo, medio compliqueti. Cambié la ubicación del texto en la portada por arriba a la derecha y le dí más espacio</w:t>
+      </w:r>
+      <w:r>
+        <w:rPr>
+          <w:rFonts w:ascii="Courier New" w:hAnsi="Courier New" w:cs="Courier New"/>
+        </w:rPr>
+        <w:t xml:space="preserve"> al botón</w:t>
+      </w:r>
+    </w:p>
+    <w:p>
+      <w:pPr>
+        <w:pStyle w:val="Textosinformato"/>
+        <w:numPr>
+          <w:ilvl w:val="0"/>
+          <w:numId w:val="1"/>
+        </w:numPr>
+        <w:rPr>
+          <w:rFonts w:ascii="Courier New" w:hAnsi="Courier New" w:cs="Courier New"/>
+        </w:rPr>
+      </w:pPr>
+      <w:r>
+        <w:rPr>
+          <w:rFonts w:ascii="Courier New" w:hAnsi="Courier New" w:cs="Courier New"/>
+        </w:rPr>
+        <w:t>Rebotando entre el Css, la carpeta de imágenes y el index. Organicé las fotos de flores, usé algunas mías del jardín y otras de pixabay. Cambié unas cuantas cosas del CSS, sobre todo colores, alineación y padding. No creo que llegue a tiempo de cambiar la fuente.</w:t>
       </w:r>
     </w:p>
     <w:sectPr>

</xml_diff>

<commit_message>
nueva clase en el header
</commit_message>
<xml_diff>
--- a/la historia del proyecto.docx
+++ b/la historia del proyecto.docx
@@ -198,6 +198,24 @@
           <w:rFonts w:ascii="Courier New" w:hAnsi="Courier New" w:cs="Courier New"/>
         </w:rPr>
         <w:t>Rebotando entre el Css, la carpeta de imágenes y el index. Organicé las fotos de flores, usé algunas mías del jardín y otras de pixabay. Cambié unas cuantas cosas del CSS, sobre todo colores, alineación y padding. No creo que llegue a tiempo de cambiar la fuente.</w:t>
+      </w:r>
+    </w:p>
+    <w:p>
+      <w:pPr>
+        <w:pStyle w:val="Textosinformato"/>
+        <w:numPr>
+          <w:ilvl w:val="0"/>
+          <w:numId w:val="1"/>
+        </w:numPr>
+        <w:rPr>
+          <w:rFonts w:ascii="Courier New" w:hAnsi="Courier New" w:cs="Courier New"/>
+        </w:rPr>
+      </w:pPr>
+      <w:r>
+        <w:rPr>
+          <w:rFonts w:ascii="Courier New" w:hAnsi="Courier New" w:cs="Courier New"/>
+        </w:rPr>
+        <w:t>Nueva clase logo text en el header para poder poner el nombre del negocio. Chequeando que ande bien la responsividad.</w:t>
       </w:r>
     </w:p>
     <w:sectPr>

</xml_diff>

<commit_message>
cambios en la seccion reseñas, nuevas fotos, cambios en la seccion newsletter
</commit_message>
<xml_diff>
--- a/la historia del proyecto.docx
+++ b/la historia del proyecto.docx
@@ -53,7 +53,21 @@
         <w:rPr>
           <w:rFonts w:ascii="Courier New" w:hAnsi="Courier New" w:cs="Courier New"/>
         </w:rPr>
-        <w:t>Armé un .txt donde colocaré los enlaces que usé para mi proyecto.</w:t>
+        <w:t>Armé un .</w:t>
+      </w:r>
+      <w:proofErr w:type="spellStart"/>
+      <w:r>
+        <w:rPr>
+          <w:rFonts w:ascii="Courier New" w:hAnsi="Courier New" w:cs="Courier New"/>
+        </w:rPr>
+        <w:t>txt</w:t>
+      </w:r>
+      <w:proofErr w:type="spellEnd"/>
+      <w:r>
+        <w:rPr>
+          <w:rFonts w:ascii="Courier New" w:hAnsi="Courier New" w:cs="Courier New"/>
+        </w:rPr>
+        <w:t xml:space="preserve"> donde colocaré los enlaces que usé para mi proyecto.</w:t>
       </w:r>
     </w:p>
     <w:p>
@@ -71,7 +85,21 @@
         <w:rPr>
           <w:rFonts w:ascii="Courier New" w:hAnsi="Courier New" w:cs="Courier New"/>
         </w:rPr>
-        <w:t>Agregué un favicon de florcitas</w:t>
+        <w:t xml:space="preserve">Agregué un </w:t>
+      </w:r>
+      <w:proofErr w:type="spellStart"/>
+      <w:r>
+        <w:rPr>
+          <w:rFonts w:ascii="Courier New" w:hAnsi="Courier New" w:cs="Courier New"/>
+        </w:rPr>
+        <w:t>favicon</w:t>
+      </w:r>
+      <w:proofErr w:type="spellEnd"/>
+      <w:r>
+        <w:rPr>
+          <w:rFonts w:ascii="Courier New" w:hAnsi="Courier New" w:cs="Courier New"/>
+        </w:rPr>
+        <w:t xml:space="preserve"> de florcitas</w:t>
       </w:r>
     </w:p>
     <w:p>
@@ -101,7 +129,49 @@
         <w:rPr>
           <w:rFonts w:ascii="Courier New" w:hAnsi="Courier New" w:cs="Courier New"/>
         </w:rPr>
-        <w:t>o en el html como en el css, elegí un campo floral (imagen gratuita de pixabay) como foto principal</w:t>
+        <w:t xml:space="preserve">o en el </w:t>
+      </w:r>
+      <w:proofErr w:type="spellStart"/>
+      <w:r>
+        <w:rPr>
+          <w:rFonts w:ascii="Courier New" w:hAnsi="Courier New" w:cs="Courier New"/>
+        </w:rPr>
+        <w:t>html</w:t>
+      </w:r>
+      <w:proofErr w:type="spellEnd"/>
+      <w:r>
+        <w:rPr>
+          <w:rFonts w:ascii="Courier New" w:hAnsi="Courier New" w:cs="Courier New"/>
+        </w:rPr>
+        <w:t xml:space="preserve"> como en el </w:t>
+      </w:r>
+      <w:proofErr w:type="spellStart"/>
+      <w:r>
+        <w:rPr>
+          <w:rFonts w:ascii="Courier New" w:hAnsi="Courier New" w:cs="Courier New"/>
+        </w:rPr>
+        <w:t>css</w:t>
+      </w:r>
+      <w:proofErr w:type="spellEnd"/>
+      <w:r>
+        <w:rPr>
+          <w:rFonts w:ascii="Courier New" w:hAnsi="Courier New" w:cs="Courier New"/>
+        </w:rPr>
+        <w:t xml:space="preserve">, elegí un campo floral (imagen gratuita de </w:t>
+      </w:r>
+      <w:proofErr w:type="spellStart"/>
+      <w:r>
+        <w:rPr>
+          <w:rFonts w:ascii="Courier New" w:hAnsi="Courier New" w:cs="Courier New"/>
+        </w:rPr>
+        <w:t>pixabay</w:t>
+      </w:r>
+      <w:proofErr w:type="spellEnd"/>
+      <w:r>
+        <w:rPr>
+          <w:rFonts w:ascii="Courier New" w:hAnsi="Courier New" w:cs="Courier New"/>
+        </w:rPr>
+        <w:t>) como foto principal</w:t>
       </w:r>
     </w:p>
     <w:p>
@@ -131,7 +201,21 @@
         <w:rPr>
           <w:rFonts w:ascii="Courier New" w:hAnsi="Courier New" w:cs="Courier New"/>
         </w:rPr>
-        <w:t xml:space="preserve"> en canvas (me cansé de buscar imágenes gratuitas)</w:t>
+        <w:t xml:space="preserve"> en </w:t>
+      </w:r>
+      <w:proofErr w:type="spellStart"/>
+      <w:r>
+        <w:rPr>
+          <w:rFonts w:ascii="Courier New" w:hAnsi="Courier New" w:cs="Courier New"/>
+        </w:rPr>
+        <w:t>canvas</w:t>
+      </w:r>
+      <w:proofErr w:type="spellEnd"/>
+      <w:r>
+        <w:rPr>
+          <w:rFonts w:ascii="Courier New" w:hAnsi="Courier New" w:cs="Courier New"/>
+        </w:rPr>
+        <w:t xml:space="preserve"> (me cansé de buscar imágenes gratuitas)</w:t>
       </w:r>
       <w:r>
         <w:rPr>
@@ -155,7 +239,29 @@
         <w:rPr>
           <w:rFonts w:ascii="Courier New" w:hAnsi="Courier New" w:cs="Courier New"/>
         </w:rPr>
-        <w:t>Creé un .gitignore para no andar subiendo guardados temporales y esas cosas</w:t>
+        <w:t xml:space="preserve">Creé </w:t>
+      </w:r>
+      <w:proofErr w:type="gramStart"/>
+      <w:r>
+        <w:rPr>
+          <w:rFonts w:ascii="Courier New" w:hAnsi="Courier New" w:cs="Courier New"/>
+        </w:rPr>
+        <w:t>un .</w:t>
+      </w:r>
+      <w:proofErr w:type="spellStart"/>
+      <w:r>
+        <w:rPr>
+          <w:rFonts w:ascii="Courier New" w:hAnsi="Courier New" w:cs="Courier New"/>
+        </w:rPr>
+        <w:t>gitignore</w:t>
+      </w:r>
+      <w:proofErr w:type="spellEnd"/>
+      <w:proofErr w:type="gramEnd"/>
+      <w:r>
+        <w:rPr>
+          <w:rFonts w:ascii="Courier New" w:hAnsi="Courier New" w:cs="Courier New"/>
+        </w:rPr>
+        <w:t xml:space="preserve"> para no andar subiendo guardados temporales y esas cosas</w:t>
       </w:r>
     </w:p>
     <w:p>
@@ -173,7 +279,35 @@
         <w:rPr>
           <w:rFonts w:ascii="Courier New" w:hAnsi="Courier New" w:cs="Courier New"/>
         </w:rPr>
-        <w:t>Bueno, estoy luchando con los colores, que todo sea coherente y además que al cambiar de pantalla se siga leyendo, medio compliqueti. Cambié la ubicación del texto en la portada por arriba a la derecha y le dí más espacio</w:t>
+        <w:t xml:space="preserve">Bueno, estoy luchando con los colores, que todo sea coherente y además que al cambiar de pantalla se siga leyendo, medio </w:t>
+      </w:r>
+      <w:proofErr w:type="spellStart"/>
+      <w:r>
+        <w:rPr>
+          <w:rFonts w:ascii="Courier New" w:hAnsi="Courier New" w:cs="Courier New"/>
+        </w:rPr>
+        <w:t>compliqueti</w:t>
+      </w:r>
+      <w:proofErr w:type="spellEnd"/>
+      <w:r>
+        <w:rPr>
+          <w:rFonts w:ascii="Courier New" w:hAnsi="Courier New" w:cs="Courier New"/>
+        </w:rPr>
+        <w:t xml:space="preserve">. Cambié la ubicación del texto en la portada por arriba a la derecha y le </w:t>
+      </w:r>
+      <w:proofErr w:type="spellStart"/>
+      <w:r>
+        <w:rPr>
+          <w:rFonts w:ascii="Courier New" w:hAnsi="Courier New" w:cs="Courier New"/>
+        </w:rPr>
+        <w:t>dí</w:t>
+      </w:r>
+      <w:proofErr w:type="spellEnd"/>
+      <w:r>
+        <w:rPr>
+          <w:rFonts w:ascii="Courier New" w:hAnsi="Courier New" w:cs="Courier New"/>
+        </w:rPr>
+        <w:t xml:space="preserve"> más espacio</w:t>
       </w:r>
       <w:r>
         <w:rPr>
@@ -197,7 +331,63 @@
         <w:rPr>
           <w:rFonts w:ascii="Courier New" w:hAnsi="Courier New" w:cs="Courier New"/>
         </w:rPr>
-        <w:t>Rebotando entre el Css, la carpeta de imágenes y el index. Organicé las fotos de flores, usé algunas mías del jardín y otras de pixabay. Cambié unas cuantas cosas del CSS, sobre todo colores, alineación y padding. No creo que llegue a tiempo de cambiar la fuente.</w:t>
+        <w:t xml:space="preserve">Rebotando entre el </w:t>
+      </w:r>
+      <w:proofErr w:type="spellStart"/>
+      <w:r>
+        <w:rPr>
+          <w:rFonts w:ascii="Courier New" w:hAnsi="Courier New" w:cs="Courier New"/>
+        </w:rPr>
+        <w:t>Css</w:t>
+      </w:r>
+      <w:proofErr w:type="spellEnd"/>
+      <w:r>
+        <w:rPr>
+          <w:rFonts w:ascii="Courier New" w:hAnsi="Courier New" w:cs="Courier New"/>
+        </w:rPr>
+        <w:t xml:space="preserve">, la carpeta de imágenes y el </w:t>
+      </w:r>
+      <w:proofErr w:type="spellStart"/>
+      <w:r>
+        <w:rPr>
+          <w:rFonts w:ascii="Courier New" w:hAnsi="Courier New" w:cs="Courier New"/>
+        </w:rPr>
+        <w:t>index</w:t>
+      </w:r>
+      <w:proofErr w:type="spellEnd"/>
+      <w:r>
+        <w:rPr>
+          <w:rFonts w:ascii="Courier New" w:hAnsi="Courier New" w:cs="Courier New"/>
+        </w:rPr>
+        <w:t xml:space="preserve">. Organicé las fotos de flores, usé algunas mías del jardín y otras de </w:t>
+      </w:r>
+      <w:proofErr w:type="spellStart"/>
+      <w:r>
+        <w:rPr>
+          <w:rFonts w:ascii="Courier New" w:hAnsi="Courier New" w:cs="Courier New"/>
+        </w:rPr>
+        <w:t>pixabay</w:t>
+      </w:r>
+      <w:proofErr w:type="spellEnd"/>
+      <w:r>
+        <w:rPr>
+          <w:rFonts w:ascii="Courier New" w:hAnsi="Courier New" w:cs="Courier New"/>
+        </w:rPr>
+        <w:t xml:space="preserve">. Cambié unas cuantas cosas del CSS, sobre todo colores, alineación y </w:t>
+      </w:r>
+      <w:proofErr w:type="spellStart"/>
+      <w:r>
+        <w:rPr>
+          <w:rFonts w:ascii="Courier New" w:hAnsi="Courier New" w:cs="Courier New"/>
+        </w:rPr>
+        <w:t>padding</w:t>
+      </w:r>
+      <w:proofErr w:type="spellEnd"/>
+      <w:r>
+        <w:rPr>
+          <w:rFonts w:ascii="Courier New" w:hAnsi="Courier New" w:cs="Courier New"/>
+        </w:rPr>
+        <w:t>. No creo que llegue a tiempo de cambiar la fuente.</w:t>
       </w:r>
     </w:p>
     <w:p>
@@ -215,8 +405,94 @@
         <w:rPr>
           <w:rFonts w:ascii="Courier New" w:hAnsi="Courier New" w:cs="Courier New"/>
         </w:rPr>
-        <w:t>Nueva clase logo text en el header para poder poner el nombre del negocio. Chequeando que ande bien la responsividad.</w:t>
-      </w:r>
+        <w:t xml:space="preserve">Nueva clase logo </w:t>
+      </w:r>
+      <w:proofErr w:type="spellStart"/>
+      <w:r>
+        <w:rPr>
+          <w:rFonts w:ascii="Courier New" w:hAnsi="Courier New" w:cs="Courier New"/>
+        </w:rPr>
+        <w:t>text</w:t>
+      </w:r>
+      <w:proofErr w:type="spellEnd"/>
+      <w:r>
+        <w:rPr>
+          <w:rFonts w:ascii="Courier New" w:hAnsi="Courier New" w:cs="Courier New"/>
+        </w:rPr>
+        <w:t xml:space="preserve"> en el </w:t>
+      </w:r>
+      <w:proofErr w:type="spellStart"/>
+      <w:r>
+        <w:rPr>
+          <w:rFonts w:ascii="Courier New" w:hAnsi="Courier New" w:cs="Courier New"/>
+        </w:rPr>
+        <w:t>header</w:t>
+      </w:r>
+      <w:proofErr w:type="spellEnd"/>
+      <w:r>
+        <w:rPr>
+          <w:rFonts w:ascii="Courier New" w:hAnsi="Courier New" w:cs="Courier New"/>
+        </w:rPr>
+        <w:t xml:space="preserve"> para poder poner el nombre del negocio. Chequeando que ande bien la </w:t>
+      </w:r>
+      <w:proofErr w:type="spellStart"/>
+      <w:r>
+        <w:rPr>
+          <w:rFonts w:ascii="Courier New" w:hAnsi="Courier New" w:cs="Courier New"/>
+        </w:rPr>
+        <w:t>responsividad</w:t>
+      </w:r>
+      <w:proofErr w:type="spellEnd"/>
+      <w:r>
+        <w:rPr>
+          <w:rFonts w:ascii="Courier New" w:hAnsi="Courier New" w:cs="Courier New"/>
+        </w:rPr>
+        <w:t>.</w:t>
+      </w:r>
+    </w:p>
+    <w:p>
+      <w:pPr>
+        <w:pStyle w:val="Textosinformato"/>
+        <w:numPr>
+          <w:ilvl w:val="0"/>
+          <w:numId w:val="1"/>
+        </w:numPr>
+        <w:rPr>
+          <w:rFonts w:ascii="Courier New" w:hAnsi="Courier New" w:cs="Courier New"/>
+        </w:rPr>
+      </w:pPr>
+      <w:r>
+        <w:rPr>
+          <w:rFonts w:ascii="Courier New" w:hAnsi="Courier New" w:cs="Courier New"/>
+        </w:rPr>
+        <w:t>Cambiando los colores y los textos de la sección reseñas. Nota para el futuro: usar diccionario de colores (</w:t>
+      </w:r>
+      <w:proofErr w:type="gramStart"/>
+      <w:r>
+        <w:rPr>
+          <w:rFonts w:ascii="Courier New" w:hAnsi="Courier New" w:cs="Courier New"/>
+        </w:rPr>
+        <w:t>averiguar cómo hacerlo, ja!</w:t>
+      </w:r>
+      <w:proofErr w:type="gramEnd"/>
+      <w:r>
+        <w:rPr>
+          <w:rFonts w:ascii="Courier New" w:hAnsi="Courier New" w:cs="Courier New"/>
+        </w:rPr>
+        <w:t>)</w:t>
+      </w:r>
+    </w:p>
+    <w:p>
+      <w:pPr>
+        <w:pStyle w:val="Textosinformato"/>
+        <w:numPr>
+          <w:ilvl w:val="0"/>
+          <w:numId w:val="1"/>
+        </w:numPr>
+        <w:rPr>
+          <w:rFonts w:ascii="Courier New" w:hAnsi="Courier New" w:cs="Courier New"/>
+        </w:rPr>
+      </w:pPr>
     </w:p>
     <w:sectPr>
       <w:pgSz w:w="11906" w:h="16838"/>

</xml_diff>

<commit_message>
cambios en el doc
</commit_message>
<xml_diff>
--- a/la historia del proyecto.docx
+++ b/la historia del proyecto.docx
@@ -566,6 +566,24 @@
           <w:rFonts w:ascii="Courier New" w:hAnsi="Courier New" w:cs="Courier New"/>
         </w:rPr>
         <w:t>, saqué el copyright del profe para que no tenga que hacerse cargo de este emparchado</w:t>
+      </w:r>
+    </w:p>
+    <w:p>
+      <w:pPr>
+        <w:pStyle w:val="Textosinformato"/>
+        <w:numPr>
+          <w:ilvl w:val="0"/>
+          <w:numId w:val="1"/>
+        </w:numPr>
+        <w:rPr>
+          <w:rFonts w:ascii="Courier New" w:hAnsi="Courier New" w:cs="Courier New"/>
+        </w:rPr>
+      </w:pPr>
+      <w:r>
+        <w:rPr>
+          <w:rFonts w:ascii="Courier New" w:hAnsi="Courier New" w:cs="Courier New"/>
+        </w:rPr>
+        <w:t>Me puse con el formulario, agregando imagen de fondo</w:t>
       </w:r>
     </w:p>
     <w:sectPr>

</xml_diff>

<commit_message>
cambios en el banner, en el doc, creacion del .pdf
</commit_message>
<xml_diff>
--- a/la historia del proyecto.docx
+++ b/la historia del proyecto.docx
@@ -53,53 +53,25 @@
         <w:rPr>
           <w:rFonts w:ascii="Courier New" w:hAnsi="Courier New" w:cs="Courier New"/>
         </w:rPr>
-        <w:t>Armé un .</w:t>
-      </w:r>
-      <w:proofErr w:type="spellStart"/>
-      <w:r>
-        <w:rPr>
-          <w:rFonts w:ascii="Courier New" w:hAnsi="Courier New" w:cs="Courier New"/>
-        </w:rPr>
-        <w:t>txt</w:t>
-      </w:r>
-      <w:proofErr w:type="spellEnd"/>
-      <w:r>
-        <w:rPr>
-          <w:rFonts w:ascii="Courier New" w:hAnsi="Courier New" w:cs="Courier New"/>
-        </w:rPr>
-        <w:t xml:space="preserve"> donde colocaré los enlaces que usé para mi proyecto.</w:t>
-      </w:r>
-    </w:p>
-    <w:p>
-      <w:pPr>
-        <w:pStyle w:val="Textosinformato"/>
-        <w:numPr>
-          <w:ilvl w:val="0"/>
-          <w:numId w:val="1"/>
-        </w:numPr>
-        <w:rPr>
-          <w:rFonts w:ascii="Courier New" w:hAnsi="Courier New" w:cs="Courier New"/>
-        </w:rPr>
-      </w:pPr>
-      <w:r>
-        <w:rPr>
-          <w:rFonts w:ascii="Courier New" w:hAnsi="Courier New" w:cs="Courier New"/>
-        </w:rPr>
-        <w:t xml:space="preserve">Agregué un </w:t>
-      </w:r>
-      <w:proofErr w:type="spellStart"/>
-      <w:r>
-        <w:rPr>
-          <w:rFonts w:ascii="Courier New" w:hAnsi="Courier New" w:cs="Courier New"/>
-        </w:rPr>
-        <w:t>favicon</w:t>
-      </w:r>
-      <w:proofErr w:type="spellEnd"/>
-      <w:r>
-        <w:rPr>
-          <w:rFonts w:ascii="Courier New" w:hAnsi="Courier New" w:cs="Courier New"/>
-        </w:rPr>
-        <w:t xml:space="preserve"> de florcitas</w:t>
+        <w:t>Armé un .txt donde colocaré los enlaces que usé para mi proyecto.</w:t>
+      </w:r>
+    </w:p>
+    <w:p>
+      <w:pPr>
+        <w:pStyle w:val="Textosinformato"/>
+        <w:numPr>
+          <w:ilvl w:val="0"/>
+          <w:numId w:val="1"/>
+        </w:numPr>
+        <w:rPr>
+          <w:rFonts w:ascii="Courier New" w:hAnsi="Courier New" w:cs="Courier New"/>
+        </w:rPr>
+      </w:pPr>
+      <w:r>
+        <w:rPr>
+          <w:rFonts w:ascii="Courier New" w:hAnsi="Courier New" w:cs="Courier New"/>
+        </w:rPr>
+        <w:t>Agregué un favicon de florcitas</w:t>
       </w:r>
     </w:p>
     <w:p>
@@ -129,49 +101,7 @@
         <w:rPr>
           <w:rFonts w:ascii="Courier New" w:hAnsi="Courier New" w:cs="Courier New"/>
         </w:rPr>
-        <w:t xml:space="preserve">o en el </w:t>
-      </w:r>
-      <w:proofErr w:type="spellStart"/>
-      <w:r>
-        <w:rPr>
-          <w:rFonts w:ascii="Courier New" w:hAnsi="Courier New" w:cs="Courier New"/>
-        </w:rPr>
-        <w:t>html</w:t>
-      </w:r>
-      <w:proofErr w:type="spellEnd"/>
-      <w:r>
-        <w:rPr>
-          <w:rFonts w:ascii="Courier New" w:hAnsi="Courier New" w:cs="Courier New"/>
-        </w:rPr>
-        <w:t xml:space="preserve"> como en el </w:t>
-      </w:r>
-      <w:proofErr w:type="spellStart"/>
-      <w:r>
-        <w:rPr>
-          <w:rFonts w:ascii="Courier New" w:hAnsi="Courier New" w:cs="Courier New"/>
-        </w:rPr>
-        <w:t>css</w:t>
-      </w:r>
-      <w:proofErr w:type="spellEnd"/>
-      <w:r>
-        <w:rPr>
-          <w:rFonts w:ascii="Courier New" w:hAnsi="Courier New" w:cs="Courier New"/>
-        </w:rPr>
-        <w:t xml:space="preserve">, elegí un campo floral (imagen gratuita de </w:t>
-      </w:r>
-      <w:proofErr w:type="spellStart"/>
-      <w:r>
-        <w:rPr>
-          <w:rFonts w:ascii="Courier New" w:hAnsi="Courier New" w:cs="Courier New"/>
-        </w:rPr>
-        <w:t>pixabay</w:t>
-      </w:r>
-      <w:proofErr w:type="spellEnd"/>
-      <w:r>
-        <w:rPr>
-          <w:rFonts w:ascii="Courier New" w:hAnsi="Courier New" w:cs="Courier New"/>
-        </w:rPr>
-        <w:t>) como foto principal</w:t>
+        <w:t>o en el html como en el css, elegí un campo floral (imagen gratuita de pixabay) como foto principal</w:t>
       </w:r>
     </w:p>
     <w:p>
@@ -201,21 +131,7 @@
         <w:rPr>
           <w:rFonts w:ascii="Courier New" w:hAnsi="Courier New" w:cs="Courier New"/>
         </w:rPr>
-        <w:t xml:space="preserve"> en </w:t>
-      </w:r>
-      <w:proofErr w:type="spellStart"/>
-      <w:r>
-        <w:rPr>
-          <w:rFonts w:ascii="Courier New" w:hAnsi="Courier New" w:cs="Courier New"/>
-        </w:rPr>
-        <w:t>canvas</w:t>
-      </w:r>
-      <w:proofErr w:type="spellEnd"/>
-      <w:r>
-        <w:rPr>
-          <w:rFonts w:ascii="Courier New" w:hAnsi="Courier New" w:cs="Courier New"/>
-        </w:rPr>
-        <w:t xml:space="preserve"> (me cansé de buscar imágenes gratuitas)</w:t>
+        <w:t xml:space="preserve"> en canvas (me cansé de buscar imágenes gratuitas)</w:t>
       </w:r>
       <w:r>
         <w:rPr>
@@ -239,75 +155,25 @@
         <w:rPr>
           <w:rFonts w:ascii="Courier New" w:hAnsi="Courier New" w:cs="Courier New"/>
         </w:rPr>
-        <w:t xml:space="preserve">Creé </w:t>
-      </w:r>
-      <w:proofErr w:type="gramStart"/>
-      <w:r>
-        <w:rPr>
-          <w:rFonts w:ascii="Courier New" w:hAnsi="Courier New" w:cs="Courier New"/>
-        </w:rPr>
-        <w:t>un .</w:t>
-      </w:r>
-      <w:proofErr w:type="spellStart"/>
-      <w:r>
-        <w:rPr>
-          <w:rFonts w:ascii="Courier New" w:hAnsi="Courier New" w:cs="Courier New"/>
-        </w:rPr>
-        <w:t>gitignore</w:t>
-      </w:r>
-      <w:proofErr w:type="spellEnd"/>
-      <w:proofErr w:type="gramEnd"/>
-      <w:r>
-        <w:rPr>
-          <w:rFonts w:ascii="Courier New" w:hAnsi="Courier New" w:cs="Courier New"/>
-        </w:rPr>
-        <w:t xml:space="preserve"> para no andar subiendo guardados temporales y esas cosas</w:t>
-      </w:r>
-    </w:p>
-    <w:p>
-      <w:pPr>
-        <w:pStyle w:val="Textosinformato"/>
-        <w:numPr>
-          <w:ilvl w:val="0"/>
-          <w:numId w:val="1"/>
-        </w:numPr>
-        <w:rPr>
-          <w:rFonts w:ascii="Courier New" w:hAnsi="Courier New" w:cs="Courier New"/>
-        </w:rPr>
-      </w:pPr>
-      <w:r>
-        <w:rPr>
-          <w:rFonts w:ascii="Courier New" w:hAnsi="Courier New" w:cs="Courier New"/>
-        </w:rPr>
-        <w:t xml:space="preserve">Bueno, estoy luchando con los colores, que todo sea coherente y además que al cambiar de pantalla se siga leyendo, medio </w:t>
-      </w:r>
-      <w:proofErr w:type="spellStart"/>
-      <w:r>
-        <w:rPr>
-          <w:rFonts w:ascii="Courier New" w:hAnsi="Courier New" w:cs="Courier New"/>
-        </w:rPr>
-        <w:t>compliqueti</w:t>
-      </w:r>
-      <w:proofErr w:type="spellEnd"/>
-      <w:r>
-        <w:rPr>
-          <w:rFonts w:ascii="Courier New" w:hAnsi="Courier New" w:cs="Courier New"/>
-        </w:rPr>
-        <w:t xml:space="preserve">. Cambié la ubicación del texto en la portada por arriba a la derecha y le </w:t>
-      </w:r>
-      <w:proofErr w:type="spellStart"/>
-      <w:r>
-        <w:rPr>
-          <w:rFonts w:ascii="Courier New" w:hAnsi="Courier New" w:cs="Courier New"/>
-        </w:rPr>
-        <w:t>dí</w:t>
-      </w:r>
-      <w:proofErr w:type="spellEnd"/>
-      <w:r>
-        <w:rPr>
-          <w:rFonts w:ascii="Courier New" w:hAnsi="Courier New" w:cs="Courier New"/>
-        </w:rPr>
-        <w:t xml:space="preserve"> más espacio</w:t>
+        <w:t>Creé un .gitignore para no andar subiendo guardados temporales y esas cosas</w:t>
+      </w:r>
+    </w:p>
+    <w:p>
+      <w:pPr>
+        <w:pStyle w:val="Textosinformato"/>
+        <w:numPr>
+          <w:ilvl w:val="0"/>
+          <w:numId w:val="1"/>
+        </w:numPr>
+        <w:rPr>
+          <w:rFonts w:ascii="Courier New" w:hAnsi="Courier New" w:cs="Courier New"/>
+        </w:rPr>
+      </w:pPr>
+      <w:r>
+        <w:rPr>
+          <w:rFonts w:ascii="Courier New" w:hAnsi="Courier New" w:cs="Courier New"/>
+        </w:rPr>
+        <w:t>Bueno, estoy luchando con los colores, que todo sea coherente y además que al cambiar de pantalla se siga leyendo, medio compliqueti. Cambié la ubicación del texto en la portada por arriba a la derecha y le dí más espacio</w:t>
       </w:r>
       <w:r>
         <w:rPr>
@@ -331,241 +197,79 @@
         <w:rPr>
           <w:rFonts w:ascii="Courier New" w:hAnsi="Courier New" w:cs="Courier New"/>
         </w:rPr>
-        <w:t xml:space="preserve">Rebotando entre el </w:t>
-      </w:r>
-      <w:proofErr w:type="spellStart"/>
-      <w:r>
-        <w:rPr>
-          <w:rFonts w:ascii="Courier New" w:hAnsi="Courier New" w:cs="Courier New"/>
-        </w:rPr>
-        <w:t>Css</w:t>
-      </w:r>
-      <w:proofErr w:type="spellEnd"/>
-      <w:r>
-        <w:rPr>
-          <w:rFonts w:ascii="Courier New" w:hAnsi="Courier New" w:cs="Courier New"/>
-        </w:rPr>
-        <w:t xml:space="preserve">, la carpeta de imágenes y el </w:t>
-      </w:r>
-      <w:proofErr w:type="spellStart"/>
-      <w:r>
-        <w:rPr>
-          <w:rFonts w:ascii="Courier New" w:hAnsi="Courier New" w:cs="Courier New"/>
-        </w:rPr>
-        <w:t>index</w:t>
-      </w:r>
-      <w:proofErr w:type="spellEnd"/>
-      <w:r>
-        <w:rPr>
-          <w:rFonts w:ascii="Courier New" w:hAnsi="Courier New" w:cs="Courier New"/>
-        </w:rPr>
-        <w:t xml:space="preserve">. Organicé las fotos de flores, usé algunas mías del jardín y otras de </w:t>
-      </w:r>
-      <w:proofErr w:type="spellStart"/>
-      <w:r>
-        <w:rPr>
-          <w:rFonts w:ascii="Courier New" w:hAnsi="Courier New" w:cs="Courier New"/>
-        </w:rPr>
-        <w:t>pixabay</w:t>
-      </w:r>
-      <w:proofErr w:type="spellEnd"/>
-      <w:r>
-        <w:rPr>
-          <w:rFonts w:ascii="Courier New" w:hAnsi="Courier New" w:cs="Courier New"/>
-        </w:rPr>
-        <w:t xml:space="preserve">. Cambié unas cuantas cosas del CSS, sobre todo colores, alineación y </w:t>
-      </w:r>
-      <w:proofErr w:type="spellStart"/>
-      <w:r>
-        <w:rPr>
-          <w:rFonts w:ascii="Courier New" w:hAnsi="Courier New" w:cs="Courier New"/>
-        </w:rPr>
-        <w:t>padding</w:t>
-      </w:r>
-      <w:proofErr w:type="spellEnd"/>
-      <w:r>
-        <w:rPr>
-          <w:rFonts w:ascii="Courier New" w:hAnsi="Courier New" w:cs="Courier New"/>
-        </w:rPr>
-        <w:t>. No creo que llegue a tiempo de cambiar la fuente.</w:t>
-      </w:r>
-    </w:p>
-    <w:p>
-      <w:pPr>
-        <w:pStyle w:val="Textosinformato"/>
-        <w:numPr>
-          <w:ilvl w:val="0"/>
-          <w:numId w:val="1"/>
-        </w:numPr>
-        <w:rPr>
-          <w:rFonts w:ascii="Courier New" w:hAnsi="Courier New" w:cs="Courier New"/>
-        </w:rPr>
-      </w:pPr>
-      <w:r>
-        <w:rPr>
-          <w:rFonts w:ascii="Courier New" w:hAnsi="Courier New" w:cs="Courier New"/>
-        </w:rPr>
-        <w:t xml:space="preserve">Nueva clase logo </w:t>
-      </w:r>
-      <w:proofErr w:type="spellStart"/>
-      <w:r>
-        <w:rPr>
-          <w:rFonts w:ascii="Courier New" w:hAnsi="Courier New" w:cs="Courier New"/>
-        </w:rPr>
-        <w:t>text</w:t>
-      </w:r>
-      <w:proofErr w:type="spellEnd"/>
-      <w:r>
-        <w:rPr>
-          <w:rFonts w:ascii="Courier New" w:hAnsi="Courier New" w:cs="Courier New"/>
-        </w:rPr>
-        <w:t xml:space="preserve"> en el </w:t>
-      </w:r>
-      <w:proofErr w:type="spellStart"/>
-      <w:r>
-        <w:rPr>
-          <w:rFonts w:ascii="Courier New" w:hAnsi="Courier New" w:cs="Courier New"/>
-        </w:rPr>
-        <w:t>header</w:t>
-      </w:r>
-      <w:proofErr w:type="spellEnd"/>
-      <w:r>
-        <w:rPr>
-          <w:rFonts w:ascii="Courier New" w:hAnsi="Courier New" w:cs="Courier New"/>
-        </w:rPr>
-        <w:t xml:space="preserve"> para poder poner el nombre del negocio. Chequeando que ande bien la </w:t>
-      </w:r>
-      <w:proofErr w:type="spellStart"/>
-      <w:r>
-        <w:rPr>
-          <w:rFonts w:ascii="Courier New" w:hAnsi="Courier New" w:cs="Courier New"/>
-        </w:rPr>
-        <w:t>responsividad</w:t>
-      </w:r>
-      <w:proofErr w:type="spellEnd"/>
-      <w:r>
-        <w:rPr>
-          <w:rFonts w:ascii="Courier New" w:hAnsi="Courier New" w:cs="Courier New"/>
-        </w:rPr>
-        <w:t>.</w:t>
-      </w:r>
-    </w:p>
-    <w:p>
-      <w:pPr>
-        <w:pStyle w:val="Textosinformato"/>
-        <w:numPr>
-          <w:ilvl w:val="0"/>
-          <w:numId w:val="1"/>
-        </w:numPr>
-        <w:rPr>
-          <w:rFonts w:ascii="Courier New" w:hAnsi="Courier New" w:cs="Courier New"/>
-        </w:rPr>
-      </w:pPr>
-      <w:r>
-        <w:rPr>
-          <w:rFonts w:ascii="Courier New" w:hAnsi="Courier New" w:cs="Courier New"/>
-        </w:rPr>
-        <w:t>Cambiando los colores y los textos de la sección reseñas. Nota para el futuro: usar diccionario de colores (</w:t>
-      </w:r>
-      <w:proofErr w:type="gramStart"/>
-      <w:r>
-        <w:rPr>
-          <w:rFonts w:ascii="Courier New" w:hAnsi="Courier New" w:cs="Courier New"/>
-        </w:rPr>
-        <w:t>averiguar cómo hacerlo, ja!</w:t>
-      </w:r>
-      <w:proofErr w:type="gramEnd"/>
-      <w:r>
-        <w:rPr>
-          <w:rFonts w:ascii="Courier New" w:hAnsi="Courier New" w:cs="Courier New"/>
-        </w:rPr>
-        <w:t>)</w:t>
-      </w:r>
-    </w:p>
-    <w:p>
-      <w:pPr>
-        <w:pStyle w:val="Textosinformato"/>
-        <w:numPr>
-          <w:ilvl w:val="0"/>
-          <w:numId w:val="1"/>
-        </w:numPr>
-        <w:rPr>
-          <w:rFonts w:ascii="Courier New" w:hAnsi="Courier New" w:cs="Courier New"/>
-        </w:rPr>
-      </w:pPr>
-      <w:r>
-        <w:rPr>
-          <w:rFonts w:ascii="Courier New" w:hAnsi="Courier New" w:cs="Courier New"/>
-        </w:rPr>
-        <w:t xml:space="preserve">Cambiando colores, agregando </w:t>
-      </w:r>
-      <w:proofErr w:type="spellStart"/>
-      <w:r>
-        <w:rPr>
-          <w:rFonts w:ascii="Courier New" w:hAnsi="Courier New" w:cs="Courier New"/>
-        </w:rPr>
-        <w:t>hoover</w:t>
-      </w:r>
-      <w:proofErr w:type="spellEnd"/>
-      <w:r>
-        <w:rPr>
-          <w:rFonts w:ascii="Courier New" w:hAnsi="Courier New" w:cs="Courier New"/>
-        </w:rPr>
-        <w:t xml:space="preserve"> al </w:t>
-      </w:r>
-      <w:proofErr w:type="spellStart"/>
-      <w:r>
-        <w:rPr>
-          <w:rFonts w:ascii="Courier New" w:hAnsi="Courier New" w:cs="Courier New"/>
-        </w:rPr>
-        <w:t>button</w:t>
-      </w:r>
-      <w:proofErr w:type="spellEnd"/>
-      <w:r>
-        <w:rPr>
-          <w:rFonts w:ascii="Courier New" w:hAnsi="Courier New" w:cs="Courier New"/>
-        </w:rPr>
-        <w:t xml:space="preserve"> de la sección </w:t>
-      </w:r>
-      <w:proofErr w:type="spellStart"/>
-      <w:r>
-        <w:rPr>
-          <w:rFonts w:ascii="Courier New" w:hAnsi="Courier New" w:cs="Courier New"/>
-        </w:rPr>
-        <w:t>newsletter</w:t>
-      </w:r>
-      <w:proofErr w:type="spellEnd"/>
-    </w:p>
-    <w:p>
-      <w:pPr>
-        <w:pStyle w:val="Textosinformato"/>
-        <w:numPr>
-          <w:ilvl w:val="0"/>
-          <w:numId w:val="1"/>
-        </w:numPr>
-        <w:rPr>
-          <w:rFonts w:ascii="Courier New" w:hAnsi="Courier New" w:cs="Courier New"/>
-        </w:rPr>
-      </w:pPr>
-      <w:r>
-        <w:rPr>
-          <w:rFonts w:ascii="Courier New" w:hAnsi="Courier New" w:cs="Courier New"/>
-        </w:rPr>
-        <w:t xml:space="preserve">Mínimos cambios al </w:t>
-      </w:r>
-      <w:proofErr w:type="spellStart"/>
-      <w:r>
-        <w:rPr>
-          <w:rFonts w:ascii="Courier New" w:hAnsi="Courier New" w:cs="Courier New"/>
-        </w:rPr>
-        <w:t>footer</w:t>
-      </w:r>
-      <w:proofErr w:type="spellEnd"/>
-      <w:r>
-        <w:rPr>
-          <w:rFonts w:ascii="Courier New" w:hAnsi="Courier New" w:cs="Courier New"/>
-        </w:rPr>
-        <w:t>, saqué el copyright del profe para que no tenga que hacerse cargo de este emparchado</w:t>
+        <w:t>Rebotando entre el Css, la carpeta de imágenes y el index. Organicé las fotos de flores, usé algunas mías del jardín y otras de pixabay. Cambié unas cuantas cosas del CSS, sobre todo colores, alineación y padding. No creo que llegue a tiempo de cambiar la fuente.</w:t>
+      </w:r>
+    </w:p>
+    <w:p>
+      <w:pPr>
+        <w:pStyle w:val="Textosinformato"/>
+        <w:numPr>
+          <w:ilvl w:val="0"/>
+          <w:numId w:val="1"/>
+        </w:numPr>
+        <w:rPr>
+          <w:rFonts w:ascii="Courier New" w:hAnsi="Courier New" w:cs="Courier New"/>
+        </w:rPr>
+      </w:pPr>
+      <w:r>
+        <w:rPr>
+          <w:rFonts w:ascii="Courier New" w:hAnsi="Courier New" w:cs="Courier New"/>
+        </w:rPr>
+        <w:t>Nueva clase logo text en el header para poder poner el nombre del negocio. Chequeando que ande bien la responsividad.</w:t>
+      </w:r>
+    </w:p>
+    <w:p>
+      <w:pPr>
+        <w:pStyle w:val="Textosinformato"/>
+        <w:numPr>
+          <w:ilvl w:val="0"/>
+          <w:numId w:val="1"/>
+        </w:numPr>
+        <w:rPr>
+          <w:rFonts w:ascii="Courier New" w:hAnsi="Courier New" w:cs="Courier New"/>
+        </w:rPr>
+      </w:pPr>
+      <w:r>
+        <w:rPr>
+          <w:rFonts w:ascii="Courier New" w:hAnsi="Courier New" w:cs="Courier New"/>
+        </w:rPr>
+        <w:t>Cambiando los colores y los textos de la sección reseñas. Nota para el futuro: usar diccionario de colores (averiguar cómo hacerlo, ja!)</w:t>
+      </w:r>
+    </w:p>
+    <w:p>
+      <w:pPr>
+        <w:pStyle w:val="Textosinformato"/>
+        <w:numPr>
+          <w:ilvl w:val="0"/>
+          <w:numId w:val="1"/>
+        </w:numPr>
+        <w:rPr>
+          <w:rFonts w:ascii="Courier New" w:hAnsi="Courier New" w:cs="Courier New"/>
+        </w:rPr>
+      </w:pPr>
+      <w:r>
+        <w:rPr>
+          <w:rFonts w:ascii="Courier New" w:hAnsi="Courier New" w:cs="Courier New"/>
+        </w:rPr>
+        <w:t>Cambiando colores, agregando hoover al button de la sección newsletter</w:t>
+      </w:r>
+    </w:p>
+    <w:p>
+      <w:pPr>
+        <w:pStyle w:val="Textosinformato"/>
+        <w:numPr>
+          <w:ilvl w:val="0"/>
+          <w:numId w:val="1"/>
+        </w:numPr>
+        <w:rPr>
+          <w:rFonts w:ascii="Courier New" w:hAnsi="Courier New" w:cs="Courier New"/>
+        </w:rPr>
+      </w:pPr>
+      <w:r>
+        <w:rPr>
+          <w:rFonts w:ascii="Courier New" w:hAnsi="Courier New" w:cs="Courier New"/>
+        </w:rPr>
+        <w:t>Mínimos cambios al footer, saqué el copyright del profe para que no tenga que hacerse cargo de este emparchado</w:t>
       </w:r>
     </w:p>
     <w:p>
@@ -584,6 +288,42 @@
           <w:rFonts w:ascii="Courier New" w:hAnsi="Courier New" w:cs="Courier New"/>
         </w:rPr>
         <w:t>Me puse con el formulario, agregando imagen de fondo</w:t>
+      </w:r>
+    </w:p>
+    <w:p>
+      <w:pPr>
+        <w:pStyle w:val="Textosinformato"/>
+        <w:numPr>
+          <w:ilvl w:val="0"/>
+          <w:numId w:val="1"/>
+        </w:numPr>
+        <w:rPr>
+          <w:rFonts w:ascii="Courier New" w:hAnsi="Courier New" w:cs="Courier New"/>
+        </w:rPr>
+      </w:pPr>
+      <w:r>
+        <w:rPr>
+          <w:rFonts w:ascii="Courier New" w:hAnsi="Courier New" w:cs="Courier New"/>
+        </w:rPr>
+        <w:t>Ultimando detalles, arregle algunos colores que no encajaban con la estética deseada. Claude me ayudó a ponerle un poco de transparencia a la background image</w:t>
+      </w:r>
+    </w:p>
+    <w:p>
+      <w:pPr>
+        <w:pStyle w:val="Textosinformato"/>
+        <w:numPr>
+          <w:ilvl w:val="0"/>
+          <w:numId w:val="1"/>
+        </w:numPr>
+        <w:rPr>
+          <w:rFonts w:ascii="Courier New" w:hAnsi="Courier New" w:cs="Courier New"/>
+        </w:rPr>
+      </w:pPr>
+      <w:r>
+        <w:rPr>
+          <w:rFonts w:ascii="Courier New" w:hAnsi="Courier New" w:cs="Courier New"/>
+        </w:rPr>
+        <w:t>Me falta agregar los cambios en netlify, pasar este doc en un pdf, comitear últimos cambios y entregar</w:t>
       </w:r>
     </w:p>
     <w:sectPr>

</xml_diff>